<commit_message>
created feign client thing
</commit_message>
<xml_diff>
--- a/NAZIH_Youssef_ADRIA_PFE_27.docx
+++ b/NAZIH_Youssef_ADRIA_PFE_27.docx
@@ -13,6 +13,9 @@
       <w:sdtContent>
         <w:p>
           <w:r>
+            <w:rPr>
+              <w:noProof/>
+            </w:rPr>
             <mc:AlternateContent>
               <mc:Choice Requires="wps">
                 <w:drawing>
@@ -98,6 +101,9 @@
                                         <w:jc w:val="right"/>
                                       </w:pPr>
                                       <w:r>
+                                        <w:rPr>
+                                          <w:noProof/>
+                                        </w:rPr>
                                         <w:drawing>
                                           <wp:inline distT="0" distB="0" distL="0" distR="0" wp14:anchorId="6F106E17" wp14:editId="645C5992">
                                             <wp:extent cx="3065006" cy="3831336"/>
@@ -392,7 +398,7 @@
                                               <pic:cNvPicPr/>
                                             </pic:nvPicPr>
                                             <pic:blipFill>
-                                              <a:blip r:embed="rId6" cstate="print">
+                                              <a:blip r:embed="rId7" cstate="print">
                                                 <a:extLst>
                                                   <a:ext uri="{28A0092B-C50C-407E-A947-70E740481C1C}">
                                                     <a14:useLocalDpi xmlns:a14="http://schemas.microsoft.com/office/drawing/2010/main" val="0"/>
@@ -637,6 +643,9 @@
         <w:jc w:val="center"/>
       </w:pPr>
       <w:r>
+        <w:rPr>
+          <w:noProof/>
+        </w:rPr>
         <w:drawing>
           <wp:inline distT="0" distB="0" distL="0" distR="0" wp14:anchorId="5E2ACD15" wp14:editId="1FB09448">
             <wp:extent cx="4572000" cy="2463312"/>
@@ -653,7 +662,7 @@
                     <pic:cNvPicPr/>
                   </pic:nvPicPr>
                   <pic:blipFill>
-                    <a:blip r:embed="rId7"/>
+                    <a:blip r:embed="rId8"/>
                     <a:stretch>
                       <a:fillRect/>
                     </a:stretch>
@@ -704,8 +713,16 @@
         <w:rPr>
           <w:lang w:val="en-US"/>
         </w:rPr>
-        <w:t>: Repository GitHub privé</w:t>
-      </w:r>
+        <w:t xml:space="preserve">: Repository GitHub </w:t>
+      </w:r>
+      <w:proofErr w:type="spellStart"/>
+      <w:r>
+        <w:rPr>
+          <w:lang w:val="en-US"/>
+        </w:rPr>
+        <w:t>privé</w:t>
+      </w:r>
+      <w:proofErr w:type="spellEnd"/>
     </w:p>
     <w:p>
       <w:pPr>
@@ -742,6 +759,9 @@
         <w:spacing w:after="0"/>
       </w:pPr>
       <w:r>
+        <w:rPr>
+          <w:noProof/>
+        </w:rPr>
         <w:drawing>
           <wp:inline distT="0" distB="0" distL="0" distR="0" wp14:anchorId="11353683" wp14:editId="48F1BE60">
             <wp:extent cx="5943600" cy="1248410"/>
@@ -760,7 +780,7 @@
                     </pic:cNvPicPr>
                   </pic:nvPicPr>
                   <pic:blipFill>
-                    <a:blip r:embed="rId8">
+                    <a:blip r:embed="rId9">
                       <a:extLst>
                         <a:ext uri="{28A0092B-C50C-407E-A947-70E740481C1C}">
                           <a14:useLocalDpi xmlns:a14="http://schemas.microsoft.com/office/drawing/2010/main" val="0"/>
@@ -851,7 +871,21 @@
         <w:rPr>
           <w:lang w:val="en-US"/>
         </w:rPr>
-        <w:t>: Diagramme de classes</w:t>
+        <w:t xml:space="preserve">: </w:t>
+      </w:r>
+      <w:proofErr w:type="spellStart"/>
+      <w:r>
+        <w:rPr>
+          <w:lang w:val="en-US"/>
+        </w:rPr>
+        <w:t>Diagramme</w:t>
+      </w:r>
+      <w:proofErr w:type="spellEnd"/>
+      <w:r>
+        <w:rPr>
+          <w:lang w:val="en-US"/>
+        </w:rPr>
+        <w:t xml:space="preserve"> de classes</w:t>
       </w:r>
     </w:p>
     <w:p>
@@ -872,38 +906,484 @@
           <w:lang w:val="en-US"/>
         </w:rPr>
       </w:pPr>
+      <w:proofErr w:type="spellStart"/>
       <w:r>
         <w:rPr>
           <w:lang w:val="en-US"/>
         </w:rPr>
         <w:lastRenderedPageBreak/>
-        <w:t>Schéma d’architecture de projet</w:t>
-      </w:r>
-    </w:p>
-    <w:p>
-      <w:pPr>
-        <w:rPr>
-          <w:lang w:val="en-US"/>
-        </w:rPr>
-      </w:pPr>
-      <w:r>
-        <w:rPr>
-          <w:lang w:val="en-US"/>
-        </w:rPr>
-        <w:t>Le projet repose sur deux microservices, account-service pour la gestion des comptes et transaction-service pour les transactions. Chacun possède sa propre base de données et expose ses fonctionnalités via REST, GraphQL et MCP. Leur communication utilise OpenFeign avec Resilience4j pour gérer les pannes.</w:t>
-      </w:r>
-    </w:p>
-    <w:p>
-      <w:pPr>
-        <w:rPr>
-          <w:lang w:val="en-US"/>
-        </w:rPr>
-      </w:pPr>
-      <w:r>
-        <w:rPr>
-          <w:lang w:val="en-US"/>
-        </w:rPr>
-        <w:t>L’accès web passe par une gateway, avec une authentification assurée par Keycloak. Un assistant Spring AI permet également d’interroger les données depuis le web, Telegram et Discord. Kafka transmet les événements au module de détection de fraude, tandis que Docker Compose permet l’exécution locale des composants.</w:t>
+        <w:t>Schéma</w:t>
+      </w:r>
+      <w:proofErr w:type="spellEnd"/>
+      <w:r>
+        <w:rPr>
+          <w:lang w:val="en-US"/>
+        </w:rPr>
+        <w:t xml:space="preserve"> </w:t>
+      </w:r>
+      <w:proofErr w:type="spellStart"/>
+      <w:r>
+        <w:rPr>
+          <w:lang w:val="en-US"/>
+        </w:rPr>
+        <w:t>d’architecture</w:t>
+      </w:r>
+      <w:proofErr w:type="spellEnd"/>
+      <w:r>
+        <w:rPr>
+          <w:lang w:val="en-US"/>
+        </w:rPr>
+        <w:t xml:space="preserve"> de </w:t>
+      </w:r>
+      <w:proofErr w:type="spellStart"/>
+      <w:r>
+        <w:rPr>
+          <w:lang w:val="en-US"/>
+        </w:rPr>
+        <w:t>projet</w:t>
+      </w:r>
+      <w:proofErr w:type="spellEnd"/>
+    </w:p>
+    <w:p>
+      <w:pPr>
+        <w:rPr>
+          <w:lang w:val="en-US"/>
+        </w:rPr>
+      </w:pPr>
+      <w:r>
+        <w:rPr>
+          <w:lang w:val="en-US"/>
+        </w:rPr>
+        <w:t xml:space="preserve">Le </w:t>
+      </w:r>
+      <w:proofErr w:type="spellStart"/>
+      <w:r>
+        <w:rPr>
+          <w:lang w:val="en-US"/>
+        </w:rPr>
+        <w:t>projet</w:t>
+      </w:r>
+      <w:proofErr w:type="spellEnd"/>
+      <w:r>
+        <w:rPr>
+          <w:lang w:val="en-US"/>
+        </w:rPr>
+        <w:t xml:space="preserve"> repose sur deux microservices, account-service pour la gestion des </w:t>
+      </w:r>
+      <w:proofErr w:type="spellStart"/>
+      <w:r>
+        <w:rPr>
+          <w:lang w:val="en-US"/>
+        </w:rPr>
+        <w:t>comptes</w:t>
+      </w:r>
+      <w:proofErr w:type="spellEnd"/>
+      <w:r>
+        <w:rPr>
+          <w:lang w:val="en-US"/>
+        </w:rPr>
+        <w:t xml:space="preserve"> et transaction-service pour les transactions. Chacun </w:t>
+      </w:r>
+      <w:proofErr w:type="spellStart"/>
+      <w:r>
+        <w:rPr>
+          <w:lang w:val="en-US"/>
+        </w:rPr>
+        <w:t>possède</w:t>
+      </w:r>
+      <w:proofErr w:type="spellEnd"/>
+      <w:r>
+        <w:rPr>
+          <w:lang w:val="en-US"/>
+        </w:rPr>
+        <w:t xml:space="preserve"> </w:t>
+      </w:r>
+      <w:proofErr w:type="spellStart"/>
+      <w:r>
+        <w:rPr>
+          <w:lang w:val="en-US"/>
+        </w:rPr>
+        <w:t>sa</w:t>
+      </w:r>
+      <w:proofErr w:type="spellEnd"/>
+      <w:r>
+        <w:rPr>
+          <w:lang w:val="en-US"/>
+        </w:rPr>
+        <w:t xml:space="preserve"> propre base de données et expose </w:t>
+      </w:r>
+      <w:proofErr w:type="spellStart"/>
+      <w:r>
+        <w:rPr>
+          <w:lang w:val="en-US"/>
+        </w:rPr>
+        <w:t>ses</w:t>
+      </w:r>
+      <w:proofErr w:type="spellEnd"/>
+      <w:r>
+        <w:rPr>
+          <w:lang w:val="en-US"/>
+        </w:rPr>
+        <w:t xml:space="preserve"> </w:t>
+      </w:r>
+      <w:proofErr w:type="spellStart"/>
+      <w:r>
+        <w:rPr>
+          <w:lang w:val="en-US"/>
+        </w:rPr>
+        <w:t>fonctionnalités</w:t>
+      </w:r>
+      <w:proofErr w:type="spellEnd"/>
+      <w:r>
+        <w:rPr>
+          <w:lang w:val="en-US"/>
+        </w:rPr>
+        <w:t xml:space="preserve"> via REST, </w:t>
+      </w:r>
+      <w:proofErr w:type="spellStart"/>
+      <w:r>
+        <w:rPr>
+          <w:lang w:val="en-US"/>
+        </w:rPr>
+        <w:t>GraphQL</w:t>
+      </w:r>
+      <w:proofErr w:type="spellEnd"/>
+      <w:r>
+        <w:rPr>
+          <w:lang w:val="en-US"/>
+        </w:rPr>
+        <w:t xml:space="preserve"> et MCP. Leur communication </w:t>
+      </w:r>
+      <w:proofErr w:type="spellStart"/>
+      <w:proofErr w:type="gramStart"/>
+      <w:r>
+        <w:rPr>
+          <w:lang w:val="en-US"/>
+        </w:rPr>
+        <w:t>utilise</w:t>
+      </w:r>
+      <w:proofErr w:type="spellEnd"/>
+      <w:proofErr w:type="gramEnd"/>
+      <w:r>
+        <w:rPr>
+          <w:lang w:val="en-US"/>
+        </w:rPr>
+        <w:t xml:space="preserve"> </w:t>
+      </w:r>
+      <w:proofErr w:type="spellStart"/>
+      <w:r>
+        <w:rPr>
+          <w:lang w:val="en-US"/>
+        </w:rPr>
+        <w:t>OpenFeign</w:t>
+      </w:r>
+      <w:proofErr w:type="spellEnd"/>
+      <w:r>
+        <w:rPr>
+          <w:lang w:val="en-US"/>
+        </w:rPr>
+        <w:t xml:space="preserve"> avec Resilience4j pour </w:t>
+      </w:r>
+      <w:proofErr w:type="spellStart"/>
+      <w:r>
+        <w:rPr>
+          <w:lang w:val="en-US"/>
+        </w:rPr>
+        <w:t>gérer</w:t>
+      </w:r>
+      <w:proofErr w:type="spellEnd"/>
+      <w:r>
+        <w:rPr>
+          <w:lang w:val="en-US"/>
+        </w:rPr>
+        <w:t xml:space="preserve"> les </w:t>
+      </w:r>
+      <w:proofErr w:type="spellStart"/>
+      <w:r>
+        <w:rPr>
+          <w:lang w:val="en-US"/>
+        </w:rPr>
+        <w:t>pannes</w:t>
+      </w:r>
+      <w:proofErr w:type="spellEnd"/>
+      <w:r>
+        <w:rPr>
+          <w:lang w:val="en-US"/>
+        </w:rPr>
+        <w:t>.</w:t>
+      </w:r>
+    </w:p>
+    <w:p>
+      <w:pPr>
+        <w:rPr>
+          <w:lang w:val="en-US"/>
+        </w:rPr>
+      </w:pPr>
+      <w:proofErr w:type="spellStart"/>
+      <w:r>
+        <w:rPr>
+          <w:lang w:val="en-US"/>
+        </w:rPr>
+        <w:t>L’accès</w:t>
+      </w:r>
+      <w:proofErr w:type="spellEnd"/>
+      <w:r>
+        <w:rPr>
+          <w:lang w:val="en-US"/>
+        </w:rPr>
+        <w:t xml:space="preserve"> web passe par </w:t>
+      </w:r>
+      <w:proofErr w:type="spellStart"/>
+      <w:r>
+        <w:rPr>
+          <w:lang w:val="en-US"/>
+        </w:rPr>
+        <w:t>une</w:t>
+      </w:r>
+      <w:proofErr w:type="spellEnd"/>
+      <w:r>
+        <w:rPr>
+          <w:lang w:val="en-US"/>
+        </w:rPr>
+        <w:t xml:space="preserve"> gateway, avec </w:t>
+      </w:r>
+      <w:proofErr w:type="spellStart"/>
+      <w:r>
+        <w:rPr>
+          <w:lang w:val="en-US"/>
+        </w:rPr>
+        <w:t>une</w:t>
+      </w:r>
+      <w:proofErr w:type="spellEnd"/>
+      <w:r>
+        <w:rPr>
+          <w:lang w:val="en-US"/>
+        </w:rPr>
+        <w:t xml:space="preserve"> </w:t>
+      </w:r>
+      <w:proofErr w:type="spellStart"/>
+      <w:r>
+        <w:rPr>
+          <w:lang w:val="en-US"/>
+        </w:rPr>
+        <w:t>authentification</w:t>
+      </w:r>
+      <w:proofErr w:type="spellEnd"/>
+      <w:r>
+        <w:rPr>
+          <w:lang w:val="en-US"/>
+        </w:rPr>
+        <w:t xml:space="preserve"> </w:t>
+      </w:r>
+      <w:proofErr w:type="spellStart"/>
+      <w:r>
+        <w:rPr>
+          <w:lang w:val="en-US"/>
+        </w:rPr>
+        <w:t>assurée</w:t>
+      </w:r>
+      <w:proofErr w:type="spellEnd"/>
+      <w:r>
+        <w:rPr>
+          <w:lang w:val="en-US"/>
+        </w:rPr>
+        <w:t xml:space="preserve"> par </w:t>
+      </w:r>
+      <w:proofErr w:type="spellStart"/>
+      <w:r>
+        <w:rPr>
+          <w:lang w:val="en-US"/>
+        </w:rPr>
+        <w:t>Keycloak</w:t>
+      </w:r>
+      <w:proofErr w:type="spellEnd"/>
+      <w:r>
+        <w:rPr>
+          <w:lang w:val="en-US"/>
+        </w:rPr>
+        <w:t xml:space="preserve">. Un assistant Spring AI </w:t>
+      </w:r>
+      <w:proofErr w:type="spellStart"/>
+      <w:r>
+        <w:rPr>
+          <w:lang w:val="en-US"/>
+        </w:rPr>
+        <w:t>permet</w:t>
+      </w:r>
+      <w:proofErr w:type="spellEnd"/>
+      <w:r>
+        <w:rPr>
+          <w:lang w:val="en-US"/>
+        </w:rPr>
+        <w:t xml:space="preserve"> </w:t>
+      </w:r>
+      <w:proofErr w:type="spellStart"/>
+      <w:r>
+        <w:rPr>
+          <w:lang w:val="en-US"/>
+        </w:rPr>
+        <w:t>également</w:t>
+      </w:r>
+      <w:proofErr w:type="spellEnd"/>
+      <w:r>
+        <w:rPr>
+          <w:lang w:val="en-US"/>
+        </w:rPr>
+        <w:t xml:space="preserve"> </w:t>
+      </w:r>
+      <w:proofErr w:type="spellStart"/>
+      <w:r>
+        <w:rPr>
+          <w:lang w:val="en-US"/>
+        </w:rPr>
+        <w:t>d’interroger</w:t>
+      </w:r>
+      <w:proofErr w:type="spellEnd"/>
+      <w:r>
+        <w:rPr>
+          <w:lang w:val="en-US"/>
+        </w:rPr>
+        <w:t xml:space="preserve"> les données </w:t>
+      </w:r>
+      <w:proofErr w:type="spellStart"/>
+      <w:r>
+        <w:rPr>
+          <w:lang w:val="en-US"/>
+        </w:rPr>
+        <w:t>depuis</w:t>
+      </w:r>
+      <w:proofErr w:type="spellEnd"/>
+      <w:r>
+        <w:rPr>
+          <w:lang w:val="en-US"/>
+        </w:rPr>
+        <w:t xml:space="preserve"> le web, Telegram et Discord. Kafka </w:t>
+      </w:r>
+      <w:proofErr w:type="spellStart"/>
+      <w:r>
+        <w:rPr>
+          <w:lang w:val="en-US"/>
+        </w:rPr>
+        <w:t>transmet</w:t>
+      </w:r>
+      <w:proofErr w:type="spellEnd"/>
+      <w:r>
+        <w:rPr>
+          <w:lang w:val="en-US"/>
+        </w:rPr>
+        <w:t xml:space="preserve"> les </w:t>
+      </w:r>
+      <w:proofErr w:type="spellStart"/>
+      <w:r>
+        <w:rPr>
+          <w:lang w:val="en-US"/>
+        </w:rPr>
+        <w:t>événements</w:t>
+      </w:r>
+      <w:proofErr w:type="spellEnd"/>
+      <w:r>
+        <w:rPr>
+          <w:lang w:val="en-US"/>
+        </w:rPr>
+        <w:t xml:space="preserve"> au module de </w:t>
+      </w:r>
+      <w:proofErr w:type="spellStart"/>
+      <w:r>
+        <w:rPr>
+          <w:lang w:val="en-US"/>
+        </w:rPr>
+        <w:t>détection</w:t>
+      </w:r>
+      <w:proofErr w:type="spellEnd"/>
+      <w:r>
+        <w:rPr>
+          <w:lang w:val="en-US"/>
+        </w:rPr>
+        <w:t xml:space="preserve"> de </w:t>
+      </w:r>
+      <w:proofErr w:type="spellStart"/>
+      <w:r>
+        <w:rPr>
+          <w:lang w:val="en-US"/>
+        </w:rPr>
+        <w:t>fraude</w:t>
+      </w:r>
+      <w:proofErr w:type="spellEnd"/>
+      <w:r>
+        <w:rPr>
+          <w:lang w:val="en-US"/>
+        </w:rPr>
+        <w:t xml:space="preserve">, </w:t>
+      </w:r>
+      <w:proofErr w:type="spellStart"/>
+      <w:r>
+        <w:rPr>
+          <w:lang w:val="en-US"/>
+        </w:rPr>
+        <w:t>tandis</w:t>
+      </w:r>
+      <w:proofErr w:type="spellEnd"/>
+      <w:r>
+        <w:rPr>
+          <w:lang w:val="en-US"/>
+        </w:rPr>
+        <w:t xml:space="preserve"> </w:t>
+      </w:r>
+      <w:proofErr w:type="spellStart"/>
+      <w:r>
+        <w:rPr>
+          <w:lang w:val="en-US"/>
+        </w:rPr>
+        <w:t>que</w:t>
+      </w:r>
+      <w:proofErr w:type="spellEnd"/>
+      <w:r>
+        <w:rPr>
+          <w:lang w:val="en-US"/>
+        </w:rPr>
+        <w:t xml:space="preserve"> Docker Compose </w:t>
+      </w:r>
+      <w:proofErr w:type="spellStart"/>
+      <w:r>
+        <w:rPr>
+          <w:lang w:val="en-US"/>
+        </w:rPr>
+        <w:t>permet</w:t>
+      </w:r>
+      <w:proofErr w:type="spellEnd"/>
+      <w:r>
+        <w:rPr>
+          <w:lang w:val="en-US"/>
+        </w:rPr>
+        <w:t xml:space="preserve"> </w:t>
+      </w:r>
+      <w:proofErr w:type="spellStart"/>
+      <w:r>
+        <w:rPr>
+          <w:lang w:val="en-US"/>
+        </w:rPr>
+        <w:t>l’exécution</w:t>
+      </w:r>
+      <w:proofErr w:type="spellEnd"/>
+      <w:r>
+        <w:rPr>
+          <w:lang w:val="en-US"/>
+        </w:rPr>
+        <w:t xml:space="preserve"> locale des </w:t>
+      </w:r>
+      <w:proofErr w:type="spellStart"/>
+      <w:r>
+        <w:rPr>
+          <w:lang w:val="en-US"/>
+        </w:rPr>
+        <w:t>composants</w:t>
+      </w:r>
+      <w:proofErr w:type="spellEnd"/>
+      <w:r>
+        <w:rPr>
+          <w:lang w:val="en-US"/>
+        </w:rPr>
+        <w:t>.</w:t>
       </w:r>
     </w:p>
     <w:p>
@@ -917,7 +1397,7 @@
           <w:lang w:val="en-US"/>
         </w:rPr>
         <w:drawing>
-          <wp:inline distT="0" distB="0" distL="0" distR="0" wp14:anchorId="3276033A" wp14:editId="63EDA4C2">
+          <wp:inline distT="0" distB="0" distL="0" distR="0" wp14:anchorId="3276033A" wp14:editId="75E0E93F">
             <wp:extent cx="5572970" cy="3533586"/>
             <wp:effectExtent l="133350" t="114300" r="142240" b="162560"/>
             <wp:docPr id="390850144" name="Picture 4"/>
@@ -934,7 +1414,7 @@
                     </pic:cNvPicPr>
                   </pic:nvPicPr>
                   <pic:blipFill>
-                    <a:blip r:embed="rId9" cstate="print">
+                    <a:blip r:embed="rId10" cstate="print">
                       <a:extLst>
                         <a:ext uri="{28A0092B-C50C-407E-A947-70E740481C1C}">
                           <a14:useLocalDpi xmlns:a14="http://schemas.microsoft.com/office/drawing/2010/main" val="0"/>
@@ -1025,48 +1505,169 @@
         <w:rPr>
           <w:lang w:val="en-US"/>
         </w:rPr>
-        <w:t>: Schéma d'architecture de projet</w:t>
-      </w:r>
-    </w:p>
-    <w:p>
-      <w:pPr>
-        <w:rPr>
-          <w:lang w:val="en-US"/>
-        </w:rPr>
-      </w:pPr>
-    </w:p>
-    <w:p>
-      <w:pPr>
-        <w:rPr>
-          <w:lang w:val="en-US"/>
-        </w:rPr>
-      </w:pPr>
-    </w:p>
-    <w:p>
-      <w:pPr>
-        <w:rPr>
-          <w:lang w:val="en-US"/>
-        </w:rPr>
-      </w:pPr>
-    </w:p>
-    <w:p>
-      <w:pPr>
-        <w:rPr>
-          <w:lang w:val="en-US"/>
-        </w:rPr>
-      </w:pPr>
-    </w:p>
-    <w:p>
-      <w:pPr>
-        <w:rPr>
-          <w:lang w:val="en-US"/>
-        </w:rPr>
-      </w:pPr>
+        <w:t xml:space="preserve">: </w:t>
+      </w:r>
+      <w:proofErr w:type="spellStart"/>
+      <w:r>
+        <w:rPr>
+          <w:lang w:val="en-US"/>
+        </w:rPr>
+        <w:t>Schéma</w:t>
+      </w:r>
+      <w:proofErr w:type="spellEnd"/>
+      <w:r>
+        <w:rPr>
+          <w:lang w:val="en-US"/>
+        </w:rPr>
+        <w:t xml:space="preserve"> </w:t>
+      </w:r>
+      <w:proofErr w:type="spellStart"/>
+      <w:r>
+        <w:rPr>
+          <w:lang w:val="en-US"/>
+        </w:rPr>
+        <w:t>d'architecture</w:t>
+      </w:r>
+      <w:proofErr w:type="spellEnd"/>
+      <w:r>
+        <w:rPr>
+          <w:lang w:val="en-US"/>
+        </w:rPr>
+        <w:t xml:space="preserve"> de </w:t>
+      </w:r>
+      <w:proofErr w:type="spellStart"/>
+      <w:r>
+        <w:rPr>
+          <w:lang w:val="en-US"/>
+        </w:rPr>
+        <w:t>projet</w:t>
+      </w:r>
+      <w:proofErr w:type="spellEnd"/>
+    </w:p>
+    <w:p>
+      <w:pPr>
+        <w:pStyle w:val="Heading1"/>
+        <w:numPr>
+          <w:ilvl w:val="0"/>
+          <w:numId w:val="1"/>
+        </w:numPr>
+        <w:rPr>
+          <w:lang w:val="en-US"/>
+        </w:rPr>
+      </w:pPr>
+      <w:r>
+        <w:rPr>
+          <w:lang w:val="en-US"/>
+        </w:rPr>
+        <w:t>Développement des micro-services fonctionnels</w:t>
+      </w:r>
+    </w:p>
+    <w:p>
+      <w:pPr>
+        <w:pStyle w:val="Heading2"/>
+        <w:numPr>
+          <w:ilvl w:val="1"/>
+          <w:numId w:val="1"/>
+        </w:numPr>
+        <w:rPr>
+          <w:lang w:val="en-US"/>
+        </w:rPr>
+      </w:pPr>
+      <w:proofErr w:type="gramStart"/>
+      <w:r>
+        <w:rPr>
+          <w:lang w:val="en-US"/>
+        </w:rPr>
+        <w:t>Account-Service</w:t>
+      </w:r>
+      <w:proofErr w:type="gramEnd"/>
+    </w:p>
+    <w:p>
+      <w:pPr>
+        <w:rPr>
+          <w:lang w:val="en-US"/>
+        </w:rPr>
+      </w:pPr>
+    </w:p>
+    <w:p>
+      <w:pPr>
+        <w:pStyle w:val="Heading2"/>
+        <w:numPr>
+          <w:ilvl w:val="1"/>
+          <w:numId w:val="1"/>
+        </w:numPr>
+        <w:rPr>
+          <w:lang w:val="en-US"/>
+        </w:rPr>
+      </w:pPr>
+      <w:proofErr w:type="gramStart"/>
       <w:r>
         <w:rPr>
           <w:lang w:val="en-US"/>
         </w:rPr>
         <w:lastRenderedPageBreak/>
+        <w:t>Transaction-Service</w:t>
+      </w:r>
+      <w:proofErr w:type="gramEnd"/>
+    </w:p>
+    <w:p>
+      <w:pPr>
+        <w:pStyle w:val="Heading2"/>
+        <w:numPr>
+          <w:ilvl w:val="1"/>
+          <w:numId w:val="1"/>
+        </w:numPr>
+        <w:rPr>
+          <w:lang w:val="en-US"/>
+        </w:rPr>
+      </w:pPr>
+      <w:proofErr w:type="spellStart"/>
+      <w:r>
+        <w:rPr>
+          <w:lang w:val="en-US"/>
+        </w:rPr>
+        <w:t>OpenFeign</w:t>
+      </w:r>
+      <w:proofErr w:type="spellEnd"/>
+      <w:r>
+        <w:rPr>
+          <w:lang w:val="en-US"/>
+        </w:rPr>
+        <w:t xml:space="preserve"> et Resilience4J</w:t>
+      </w:r>
+    </w:p>
+    <w:p>
+      <w:pPr>
+        <w:rPr>
+          <w:lang w:val="en-US"/>
+        </w:rPr>
+      </w:pPr>
+    </w:p>
+    <w:p>
+      <w:pPr>
+        <w:rPr>
+          <w:lang w:val="en-US"/>
+        </w:rPr>
+      </w:pPr>
+    </w:p>
+    <w:p>
+      <w:pPr>
+        <w:rPr>
+          <w:lang w:val="en-US"/>
+        </w:rPr>
+      </w:pPr>
+    </w:p>
+    <w:p>
+      <w:pPr>
+        <w:rPr>
+          <w:lang w:val="en-US"/>
+        </w:rPr>
+      </w:pPr>
+      <w:r>
+        <w:rPr>
+          <w:noProof/>
+          <w:lang w:val="en-US"/>
+        </w:rPr>
         <w:drawing>
           <wp:inline distT="0" distB="0" distL="0" distR="0" wp14:anchorId="71D5439B" wp14:editId="002E355A">
             <wp:extent cx="5943600" cy="2848610"/>
@@ -1083,7 +1684,7 @@
                     <pic:cNvPicPr/>
                   </pic:nvPicPr>
                   <pic:blipFill>
-                    <a:blip r:embed="rId10"/>
+                    <a:blip r:embed="rId11"/>
                     <a:stretch>
                       <a:fillRect/>
                     </a:stretch>
@@ -1112,6 +1713,7 @@
       </w:pPr>
       <w:r>
         <w:rPr>
+          <w:noProof/>
           <w:lang w:val="en-US"/>
         </w:rPr>
         <w:drawing>
@@ -1130,7 +1732,7 @@
                     <pic:cNvPicPr/>
                   </pic:nvPicPr>
                   <pic:blipFill>
-                    <a:blip r:embed="rId11"/>
+                    <a:blip r:embed="rId12"/>
                     <a:stretch>
                       <a:fillRect/>
                     </a:stretch>
@@ -1157,6 +1759,101 @@
           <w:lang w:val="en-US"/>
         </w:rPr>
       </w:pPr>
+      <w:r>
+        <w:rPr>
+          <w:lang w:val="en-US"/>
+        </w:rPr>
+        <w:lastRenderedPageBreak/>
+        <w:drawing>
+          <wp:inline distT="0" distB="0" distL="0" distR="0" wp14:anchorId="461C2D86" wp14:editId="3FB2937F">
+            <wp:extent cx="5943600" cy="2795270"/>
+            <wp:effectExtent l="0" t="0" r="0" b="5080"/>
+            <wp:docPr id="444516827" name="Picture 1"/>
+            <wp:cNvGraphicFramePr>
+              <a:graphicFrameLocks xmlns:a="http://schemas.openxmlformats.org/drawingml/2006/main" noChangeAspect="1"/>
+            </wp:cNvGraphicFramePr>
+            <a:graphic xmlns:a="http://schemas.openxmlformats.org/drawingml/2006/main">
+              <a:graphicData uri="http://schemas.openxmlformats.org/drawingml/2006/picture">
+                <pic:pic xmlns:pic="http://schemas.openxmlformats.org/drawingml/2006/picture">
+                  <pic:nvPicPr>
+                    <pic:cNvPr id="444516827" name=""/>
+                    <pic:cNvPicPr/>
+                  </pic:nvPicPr>
+                  <pic:blipFill>
+                    <a:blip r:embed="rId13"/>
+                    <a:stretch>
+                      <a:fillRect/>
+                    </a:stretch>
+                  </pic:blipFill>
+                  <pic:spPr>
+                    <a:xfrm>
+                      <a:off x="0" y="0"/>
+                      <a:ext cx="5943600" cy="2795270"/>
+                    </a:xfrm>
+                    <a:prstGeom prst="rect">
+                      <a:avLst/>
+                    </a:prstGeom>
+                  </pic:spPr>
+                </pic:pic>
+              </a:graphicData>
+            </a:graphic>
+          </wp:inline>
+        </w:drawing>
+      </w:r>
+    </w:p>
+    <w:p>
+      <w:pPr>
+        <w:rPr>
+          <w:lang w:val="en-US"/>
+        </w:rPr>
+      </w:pPr>
+      <w:r>
+        <w:rPr>
+          <w:lang w:val="en-US"/>
+        </w:rPr>
+        <w:drawing>
+          <wp:inline distT="0" distB="0" distL="0" distR="0" wp14:anchorId="61D30390" wp14:editId="7D0443CF">
+            <wp:extent cx="5943600" cy="2894965"/>
+            <wp:effectExtent l="0" t="0" r="0" b="635"/>
+            <wp:docPr id="53439850" name="Picture 1"/>
+            <wp:cNvGraphicFramePr>
+              <a:graphicFrameLocks xmlns:a="http://schemas.openxmlformats.org/drawingml/2006/main" noChangeAspect="1"/>
+            </wp:cNvGraphicFramePr>
+            <a:graphic xmlns:a="http://schemas.openxmlformats.org/drawingml/2006/main">
+              <a:graphicData uri="http://schemas.openxmlformats.org/drawingml/2006/picture">
+                <pic:pic xmlns:pic="http://schemas.openxmlformats.org/drawingml/2006/picture">
+                  <pic:nvPicPr>
+                    <pic:cNvPr id="53439850" name=""/>
+                    <pic:cNvPicPr/>
+                  </pic:nvPicPr>
+                  <pic:blipFill>
+                    <a:blip r:embed="rId14"/>
+                    <a:stretch>
+                      <a:fillRect/>
+                    </a:stretch>
+                  </pic:blipFill>
+                  <pic:spPr>
+                    <a:xfrm>
+                      <a:off x="0" y="0"/>
+                      <a:ext cx="5943600" cy="2894965"/>
+                    </a:xfrm>
+                    <a:prstGeom prst="rect">
+                      <a:avLst/>
+                    </a:prstGeom>
+                  </pic:spPr>
+                </pic:pic>
+              </a:graphicData>
+            </a:graphic>
+          </wp:inline>
+        </w:drawing>
+      </w:r>
+    </w:p>
+    <w:p>
+      <w:pPr>
+        <w:rPr>
+          <w:lang w:val="en-US"/>
+        </w:rPr>
+      </w:pPr>
     </w:p>
     <w:p>
       <w:pPr>
@@ -1222,9 +1919,11 @@
           <w:numId w:val="1"/>
         </w:numPr>
       </w:pPr>
+      <w:proofErr w:type="gramStart"/>
       <w:r>
         <w:t>f</w:t>
       </w:r>
+      <w:proofErr w:type="gramEnd"/>
     </w:p>
     <w:sectPr>
       <w:pgSz w:w="12240" w:h="15840"/>
@@ -1974,6 +2673,7 @@
   <w:style w:type="character" w:default="1" w:styleId="DefaultParagraphFont">
     <w:name w:val="Default Paragraph Font"/>
     <w:uiPriority w:val="1"/>
+    <w:semiHidden/>
     <w:unhideWhenUsed/>
   </w:style>
   <w:style w:type="table" w:default="1" w:styleId="TableNormal">

</xml_diff>

<commit_message>
finished up config and added bot
</commit_message>
<xml_diff>
--- a/NAZIH_Youssef_ADRIA_PFE_27.docx
+++ b/NAZIH_Youssef_ADRIA_PFE_27.docx
@@ -2089,90 +2089,6 @@
         <w:t xml:space="preserve"> HTTP 503</w:t>
       </w:r>
     </w:p>
-    <w:p/>
-    <w:p/>
-    <w:p/>
-    <w:p/>
-    <w:p>
-      <w:r>
-        <w:drawing>
-          <wp:inline distT="0" distB="0" distL="0" distR="0" wp14:anchorId="461C2D86" wp14:editId="3FB2937F">
-            <wp:extent cx="5943600" cy="2795270"/>
-            <wp:effectExtent l="0" t="0" r="0" b="5080"/>
-            <wp:docPr id="444516827" name="Picture 1"/>
-            <wp:cNvGraphicFramePr>
-              <a:graphicFrameLocks xmlns:a="http://schemas.openxmlformats.org/drawingml/2006/main" noChangeAspect="1"/>
-            </wp:cNvGraphicFramePr>
-            <a:graphic xmlns:a="http://schemas.openxmlformats.org/drawingml/2006/main">
-              <a:graphicData uri="http://schemas.openxmlformats.org/drawingml/2006/picture">
-                <pic:pic xmlns:pic="http://schemas.openxmlformats.org/drawingml/2006/picture">
-                  <pic:nvPicPr>
-                    <pic:cNvPr id="444516827" name=""/>
-                    <pic:cNvPicPr/>
-                  </pic:nvPicPr>
-                  <pic:blipFill>
-                    <a:blip r:embed="rId16"/>
-                    <a:stretch>
-                      <a:fillRect/>
-                    </a:stretch>
-                  </pic:blipFill>
-                  <pic:spPr>
-                    <a:xfrm>
-                      <a:off x="0" y="0"/>
-                      <a:ext cx="5943600" cy="2795270"/>
-                    </a:xfrm>
-                    <a:prstGeom prst="rect">
-                      <a:avLst/>
-                    </a:prstGeom>
-                  </pic:spPr>
-                </pic:pic>
-              </a:graphicData>
-            </a:graphic>
-          </wp:inline>
-        </w:drawing>
-      </w:r>
-    </w:p>
-    <w:p>
-      <w:r>
-        <w:drawing>
-          <wp:inline distT="0" distB="0" distL="0" distR="0" wp14:anchorId="61D30390" wp14:editId="7D0443CF">
-            <wp:extent cx="5943600" cy="2894965"/>
-            <wp:effectExtent l="0" t="0" r="0" b="635"/>
-            <wp:docPr id="53439850" name="Picture 1"/>
-            <wp:cNvGraphicFramePr>
-              <a:graphicFrameLocks xmlns:a="http://schemas.openxmlformats.org/drawingml/2006/main" noChangeAspect="1"/>
-            </wp:cNvGraphicFramePr>
-            <a:graphic xmlns:a="http://schemas.openxmlformats.org/drawingml/2006/main">
-              <a:graphicData uri="http://schemas.openxmlformats.org/drawingml/2006/picture">
-                <pic:pic xmlns:pic="http://schemas.openxmlformats.org/drawingml/2006/picture">
-                  <pic:nvPicPr>
-                    <pic:cNvPr id="53439850" name=""/>
-                    <pic:cNvPicPr/>
-                  </pic:nvPicPr>
-                  <pic:blipFill>
-                    <a:blip r:embed="rId17"/>
-                    <a:stretch>
-                      <a:fillRect/>
-                    </a:stretch>
-                  </pic:blipFill>
-                  <pic:spPr>
-                    <a:xfrm>
-                      <a:off x="0" y="0"/>
-                      <a:ext cx="5943600" cy="2894965"/>
-                    </a:xfrm>
-                    <a:prstGeom prst="rect">
-                      <a:avLst/>
-                    </a:prstGeom>
-                  </pic:spPr>
-                </pic:pic>
-              </a:graphicData>
-            </a:graphic>
-          </wp:inline>
-        </w:drawing>
-      </w:r>
-    </w:p>
-    <w:p/>
-    <w:p/>
     <w:p>
       <w:pPr>
         <w:pStyle w:val="Heading1"/>
@@ -2180,6 +2096,7 @@
           <w:ilvl w:val="0"/>
           <w:numId w:val="1"/>
         </w:numPr>
+        <w:spacing w:after="0"/>
       </w:pPr>
       <w:r>
         <w:lastRenderedPageBreak/>
@@ -2199,6 +2116,9 @@
       </w:r>
     </w:p>
     <w:p>
+      <w:pPr>
+        <w:spacing w:after="0"/>
+      </w:pPr>
       <w:r>
         <w:t xml:space="preserve">Spring Cloud Gateway sert de point d’entrée unique vers les </w:t>
       </w:r>
@@ -2212,11 +2132,16 @@
       </w:r>
     </w:p>
     <w:p>
+      <w:pPr>
+        <w:keepNext/>
+        <w:spacing w:after="0"/>
+        <w:jc w:val="center"/>
+      </w:pPr>
       <w:r>
         <w:drawing>
-          <wp:inline distT="0" distB="0" distL="0" distR="0" wp14:anchorId="535F6753" wp14:editId="2C2D2981">
-            <wp:extent cx="5942659" cy="3792867"/>
-            <wp:effectExtent l="0" t="0" r="1270" b="0"/>
+          <wp:inline distT="0" distB="0" distL="0" distR="0" wp14:anchorId="535F6753" wp14:editId="004F603E">
+            <wp:extent cx="5275385" cy="2939887"/>
+            <wp:effectExtent l="0" t="0" r="1905" b="0"/>
             <wp:docPr id="1435228890" name="Picture 1"/>
             <wp:cNvGraphicFramePr>
               <a:graphicFrameLocks xmlns:a="http://schemas.openxmlformats.org/drawingml/2006/main" noChangeAspect="1"/>
@@ -2229,8 +2154,8 @@
                     <pic:cNvPicPr/>
                   </pic:nvPicPr>
                   <pic:blipFill rotWithShape="1">
-                    <a:blip r:embed="rId18"/>
-                    <a:srcRect b="20273"/>
+                    <a:blip r:embed="rId16"/>
+                    <a:srcRect t="4209" b="26178"/>
                     <a:stretch>
                       <a:fillRect/>
                     </a:stretch>
@@ -2238,7 +2163,7 @@
                   <pic:spPr bwMode="auto">
                     <a:xfrm>
                       <a:off x="0" y="0"/>
-                      <a:ext cx="5943600" cy="3793467"/>
+                      <a:ext cx="5282955" cy="2944106"/>
                     </a:xfrm>
                     <a:prstGeom prst="rect">
                       <a:avLst/>
@@ -2261,6 +2186,39 @@
     </w:p>
     <w:p>
       <w:pPr>
+        <w:pStyle w:val="Caption"/>
+        <w:jc w:val="center"/>
+      </w:pPr>
+      <w:r>
+        <w:t xml:space="preserve">Figure </w:t>
+      </w:r>
+      <w:r>
+        <w:fldChar w:fldCharType="begin"/>
+      </w:r>
+      <w:r>
+        <w:instrText xml:space="preserve"> SEQ Figure \* ARABIC </w:instrText>
+      </w:r>
+      <w:r>
+        <w:fldChar w:fldCharType="separate"/>
+      </w:r>
+      <w:r>
+        <w:rPr>
+          <w:noProof/>
+        </w:rPr>
+        <w:t>10</w:t>
+      </w:r>
+      <w:r>
+        <w:fldChar w:fldCharType="end"/>
+      </w:r>
+      <w:r>
+        <w:rPr>
+          <w:lang w:val="en-US"/>
+        </w:rPr>
+        <w:t>: Spring Cloud Gateway</w:t>
+      </w:r>
+    </w:p>
+    <w:p>
+      <w:pPr>
         <w:pStyle w:val="Heading2"/>
         <w:numPr>
           <w:ilvl w:val="1"/>
@@ -2273,6 +2231,7 @@
     </w:p>
     <w:p>
       <w:pPr>
+        <w:spacing w:after="0"/>
         <w:rPr>
           <w:lang w:val="en-US"/>
         </w:rPr>
@@ -2720,7 +2679,425 @@
         <w:t xml:space="preserve"> Transaction-Service.</w:t>
       </w:r>
     </w:p>
-    <w:p/>
+    <w:p>
+      <w:pPr>
+        <w:keepNext/>
+        <w:spacing w:after="0"/>
+      </w:pPr>
+      <w:r>
+        <w:drawing>
+          <wp:inline distT="0" distB="0" distL="0" distR="0" wp14:anchorId="5717F3DF" wp14:editId="35606BFD">
+            <wp:extent cx="5943600" cy="1114425"/>
+            <wp:effectExtent l="0" t="0" r="0" b="9525"/>
+            <wp:docPr id="1473063254" name="Picture 1"/>
+            <wp:cNvGraphicFramePr>
+              <a:graphicFrameLocks xmlns:a="http://schemas.openxmlformats.org/drawingml/2006/main" noChangeAspect="1"/>
+            </wp:cNvGraphicFramePr>
+            <a:graphic xmlns:a="http://schemas.openxmlformats.org/drawingml/2006/main">
+              <a:graphicData uri="http://schemas.openxmlformats.org/drawingml/2006/picture">
+                <pic:pic xmlns:pic="http://schemas.openxmlformats.org/drawingml/2006/picture">
+                  <pic:nvPicPr>
+                    <pic:cNvPr id="1473063254" name=""/>
+                    <pic:cNvPicPr/>
+                  </pic:nvPicPr>
+                  <pic:blipFill>
+                    <a:blip r:embed="rId17"/>
+                    <a:stretch>
+                      <a:fillRect/>
+                    </a:stretch>
+                  </pic:blipFill>
+                  <pic:spPr>
+                    <a:xfrm>
+                      <a:off x="0" y="0"/>
+                      <a:ext cx="5943600" cy="1114425"/>
+                    </a:xfrm>
+                    <a:prstGeom prst="rect">
+                      <a:avLst/>
+                    </a:prstGeom>
+                  </pic:spPr>
+                </pic:pic>
+              </a:graphicData>
+            </a:graphic>
+          </wp:inline>
+        </w:drawing>
+      </w:r>
+    </w:p>
+    <w:p>
+      <w:pPr>
+        <w:pStyle w:val="Caption"/>
+        <w:jc w:val="center"/>
+        <w:rPr>
+          <w:lang w:val="en-US"/>
+        </w:rPr>
+      </w:pPr>
+      <w:r>
+        <w:t xml:space="preserve">Figure </w:t>
+      </w:r>
+      <w:r>
+        <w:fldChar w:fldCharType="begin"/>
+      </w:r>
+      <w:r>
+        <w:instrText xml:space="preserve"> SEQ Figure \* ARABIC </w:instrText>
+      </w:r>
+      <w:r>
+        <w:fldChar w:fldCharType="separate"/>
+      </w:r>
+      <w:r>
+        <w:rPr>
+          <w:noProof/>
+        </w:rPr>
+        <w:t>11</w:t>
+      </w:r>
+      <w:r>
+        <w:fldChar w:fldCharType="end"/>
+      </w:r>
+      <w:r>
+        <w:rPr>
+          <w:lang w:val="en-US"/>
+        </w:rPr>
+        <w:t>: Eureka dashboard</w:t>
+      </w:r>
+    </w:p>
+    <w:p>
+      <w:pPr>
+        <w:pStyle w:val="Heading2"/>
+        <w:numPr>
+          <w:ilvl w:val="1"/>
+          <w:numId w:val="1"/>
+        </w:numPr>
+        <w:rPr>
+          <w:lang w:val="en-US"/>
+        </w:rPr>
+      </w:pPr>
+      <w:r>
+        <w:rPr>
+          <w:lang w:val="en-US"/>
+        </w:rPr>
+        <w:lastRenderedPageBreak/>
+        <w:t>Config Service</w:t>
+      </w:r>
+    </w:p>
+    <w:p>
+      <w:pPr>
+        <w:rPr>
+          <w:lang w:val="en-US"/>
+        </w:rPr>
+      </w:pPr>
+      <w:r>
+        <w:rPr>
+          <w:lang w:val="en-US"/>
+        </w:rPr>
+        <w:t xml:space="preserve">Le service de configuration </w:t>
+      </w:r>
+      <w:proofErr w:type="spellStart"/>
+      <w:proofErr w:type="gramStart"/>
+      <w:r>
+        <w:rPr>
+          <w:lang w:val="en-US"/>
+        </w:rPr>
+        <w:t>utilise</w:t>
+      </w:r>
+      <w:proofErr w:type="spellEnd"/>
+      <w:proofErr w:type="gramEnd"/>
+      <w:r>
+        <w:rPr>
+          <w:lang w:val="en-US"/>
+        </w:rPr>
+        <w:t xml:space="preserve"> Spring Cloud Config en mode </w:t>
+      </w:r>
+      <w:proofErr w:type="spellStart"/>
+      <w:r>
+        <w:rPr>
+          <w:lang w:val="en-US"/>
+        </w:rPr>
+        <w:t>natif</w:t>
+      </w:r>
+      <w:proofErr w:type="spellEnd"/>
+      <w:r>
+        <w:rPr>
+          <w:lang w:val="en-US"/>
+        </w:rPr>
+        <w:t xml:space="preserve"> pour </w:t>
+      </w:r>
+      <w:proofErr w:type="spellStart"/>
+      <w:r>
+        <w:rPr>
+          <w:lang w:val="en-US"/>
+        </w:rPr>
+        <w:t>centraliser</w:t>
+      </w:r>
+      <w:proofErr w:type="spellEnd"/>
+      <w:r>
+        <w:rPr>
+          <w:lang w:val="en-US"/>
+        </w:rPr>
+        <w:t xml:space="preserve"> le </w:t>
+      </w:r>
+      <w:proofErr w:type="spellStart"/>
+      <w:r>
+        <w:rPr>
+          <w:lang w:val="en-US"/>
+        </w:rPr>
+        <w:t>paramètre</w:t>
+      </w:r>
+      <w:proofErr w:type="spellEnd"/>
+      <w:r>
+        <w:rPr>
+          <w:lang w:val="en-US"/>
+        </w:rPr>
+        <w:t xml:space="preserve"> </w:t>
+      </w:r>
+      <w:proofErr w:type="spellStart"/>
+      <w:r>
+        <w:rPr>
+          <w:lang w:val="en-US"/>
+        </w:rPr>
+        <w:t>bank.transaction.max</w:t>
+      </w:r>
+      <w:proofErr w:type="spellEnd"/>
+      <w:r>
+        <w:rPr>
+          <w:lang w:val="en-US"/>
+        </w:rPr>
+        <w:t xml:space="preserve">-amount=1000. Le microservice transaction-service </w:t>
+      </w:r>
+      <w:proofErr w:type="spellStart"/>
+      <w:r>
+        <w:rPr>
+          <w:lang w:val="en-US"/>
+        </w:rPr>
+        <w:t>récupère</w:t>
+      </w:r>
+      <w:proofErr w:type="spellEnd"/>
+      <w:r>
+        <w:rPr>
+          <w:lang w:val="en-US"/>
+        </w:rPr>
+        <w:t xml:space="preserve"> </w:t>
+      </w:r>
+      <w:proofErr w:type="spellStart"/>
+      <w:r>
+        <w:rPr>
+          <w:lang w:val="en-US"/>
+        </w:rPr>
+        <w:t>cette</w:t>
+      </w:r>
+      <w:proofErr w:type="spellEnd"/>
+      <w:r>
+        <w:rPr>
+          <w:lang w:val="en-US"/>
+        </w:rPr>
+        <w:t xml:space="preserve"> </w:t>
+      </w:r>
+      <w:proofErr w:type="spellStart"/>
+      <w:r>
+        <w:rPr>
+          <w:lang w:val="en-US"/>
+        </w:rPr>
+        <w:t>valeur</w:t>
+      </w:r>
+      <w:proofErr w:type="spellEnd"/>
+      <w:r>
+        <w:rPr>
+          <w:lang w:val="en-US"/>
+        </w:rPr>
+        <w:t xml:space="preserve"> au </w:t>
+      </w:r>
+      <w:proofErr w:type="spellStart"/>
+      <w:r>
+        <w:rPr>
+          <w:lang w:val="en-US"/>
+        </w:rPr>
+        <w:t>démarrage</w:t>
+      </w:r>
+      <w:proofErr w:type="spellEnd"/>
+      <w:r>
+        <w:rPr>
+          <w:lang w:val="en-US"/>
+        </w:rPr>
+        <w:t xml:space="preserve"> et </w:t>
+      </w:r>
+      <w:proofErr w:type="spellStart"/>
+      <w:r>
+        <w:rPr>
+          <w:lang w:val="en-US"/>
+        </w:rPr>
+        <w:t>vérifie</w:t>
+      </w:r>
+      <w:proofErr w:type="spellEnd"/>
+      <w:r>
+        <w:rPr>
+          <w:lang w:val="en-US"/>
+        </w:rPr>
+        <w:t xml:space="preserve"> le </w:t>
+      </w:r>
+      <w:proofErr w:type="spellStart"/>
+      <w:r>
+        <w:rPr>
+          <w:lang w:val="en-US"/>
+        </w:rPr>
+        <w:t>montant</w:t>
+      </w:r>
+      <w:proofErr w:type="spellEnd"/>
+      <w:r>
+        <w:rPr>
+          <w:lang w:val="en-US"/>
+        </w:rPr>
+        <w:t xml:space="preserve"> avant </w:t>
+      </w:r>
+      <w:proofErr w:type="spellStart"/>
+      <w:r>
+        <w:rPr>
+          <w:lang w:val="en-US"/>
+        </w:rPr>
+        <w:t>l’enregistrement</w:t>
+      </w:r>
+      <w:proofErr w:type="spellEnd"/>
+      <w:r>
+        <w:rPr>
+          <w:lang w:val="en-US"/>
+        </w:rPr>
+        <w:t xml:space="preserve">. Toute transaction </w:t>
+      </w:r>
+      <w:proofErr w:type="spellStart"/>
+      <w:r>
+        <w:rPr>
+          <w:lang w:val="en-US"/>
+        </w:rPr>
+        <w:t>dépassant</w:t>
+      </w:r>
+      <w:proofErr w:type="spellEnd"/>
+      <w:r>
+        <w:rPr>
+          <w:lang w:val="en-US"/>
+        </w:rPr>
+        <w:t xml:space="preserve"> </w:t>
+      </w:r>
+      <w:proofErr w:type="spellStart"/>
+      <w:r>
+        <w:rPr>
+          <w:lang w:val="en-US"/>
+        </w:rPr>
+        <w:t>ce</w:t>
+      </w:r>
+      <w:proofErr w:type="spellEnd"/>
+      <w:r>
+        <w:rPr>
+          <w:lang w:val="en-US"/>
+        </w:rPr>
+        <w:t xml:space="preserve"> plafond est </w:t>
+      </w:r>
+      <w:proofErr w:type="spellStart"/>
+      <w:r>
+        <w:rPr>
+          <w:lang w:val="en-US"/>
+        </w:rPr>
+        <w:t>refusée</w:t>
+      </w:r>
+      <w:proofErr w:type="spellEnd"/>
+      <w:r>
+        <w:rPr>
+          <w:lang w:val="en-US"/>
+        </w:rPr>
+        <w:t xml:space="preserve"> avec le </w:t>
+      </w:r>
+      <w:proofErr w:type="spellStart"/>
+      <w:r>
+        <w:rPr>
+          <w:lang w:val="en-US"/>
+        </w:rPr>
+        <w:t>statut</w:t>
+      </w:r>
+      <w:proofErr w:type="spellEnd"/>
+      <w:r>
+        <w:rPr>
+          <w:lang w:val="en-US"/>
+        </w:rPr>
+        <w:t xml:space="preserve"> HTTP 400.</w:t>
+      </w:r>
+    </w:p>
+    <w:p>
+      <w:pPr>
+        <w:keepNext/>
+        <w:spacing w:after="0"/>
+      </w:pPr>
+      <w:r>
+        <w:rPr>
+          <w:lang w:val="en-US"/>
+        </w:rPr>
+        <w:drawing>
+          <wp:inline distT="0" distB="0" distL="0" distR="0" wp14:anchorId="3CACAC47" wp14:editId="5917D310">
+            <wp:extent cx="5943600" cy="2263140"/>
+            <wp:effectExtent l="0" t="0" r="0" b="3810"/>
+            <wp:docPr id="752842431" name="Picture 1"/>
+            <wp:cNvGraphicFramePr>
+              <a:graphicFrameLocks xmlns:a="http://schemas.openxmlformats.org/drawingml/2006/main" noChangeAspect="1"/>
+            </wp:cNvGraphicFramePr>
+            <a:graphic xmlns:a="http://schemas.openxmlformats.org/drawingml/2006/main">
+              <a:graphicData uri="http://schemas.openxmlformats.org/drawingml/2006/picture">
+                <pic:pic xmlns:pic="http://schemas.openxmlformats.org/drawingml/2006/picture">
+                  <pic:nvPicPr>
+                    <pic:cNvPr id="752842431" name=""/>
+                    <pic:cNvPicPr/>
+                  </pic:nvPicPr>
+                  <pic:blipFill>
+                    <a:blip r:embed="rId18"/>
+                    <a:stretch>
+                      <a:fillRect/>
+                    </a:stretch>
+                  </pic:blipFill>
+                  <pic:spPr>
+                    <a:xfrm>
+                      <a:off x="0" y="0"/>
+                      <a:ext cx="5943600" cy="2263140"/>
+                    </a:xfrm>
+                    <a:prstGeom prst="rect">
+                      <a:avLst/>
+                    </a:prstGeom>
+                  </pic:spPr>
+                </pic:pic>
+              </a:graphicData>
+            </a:graphic>
+          </wp:inline>
+        </w:drawing>
+      </w:r>
+    </w:p>
+    <w:p>
+      <w:pPr>
+        <w:pStyle w:val="Caption"/>
+        <w:jc w:val="center"/>
+        <w:rPr>
+          <w:lang w:val="en-US"/>
+        </w:rPr>
+      </w:pPr>
+      <w:r>
+        <w:t xml:space="preserve">Figure </w:t>
+      </w:r>
+      <w:r>
+        <w:fldChar w:fldCharType="begin"/>
+      </w:r>
+      <w:r>
+        <w:instrText xml:space="preserve"> SEQ Figure \* ARABIC </w:instrText>
+      </w:r>
+      <w:r>
+        <w:fldChar w:fldCharType="separate"/>
+      </w:r>
+      <w:r>
+        <w:rPr>
+          <w:noProof/>
+        </w:rPr>
+        <w:t>12</w:t>
+      </w:r>
+      <w:r>
+        <w:fldChar w:fldCharType="end"/>
+      </w:r>
+      <w:r>
+        <w:rPr>
+          <w:lang w:val="en-US"/>
+        </w:rPr>
+        <w:t>: Config Service</w:t>
+      </w:r>
+    </w:p>
     <w:p>
       <w:pPr>
         <w:pStyle w:val="Heading1"/>
@@ -2729,11 +3106,16 @@
           <w:numId w:val="1"/>
         </w:numPr>
       </w:pPr>
-      <w:r>
-        <w:lastRenderedPageBreak/>
-        <w:t>C</w:t>
-      </w:r>
-    </w:p>
+      <w:proofErr w:type="spellStart"/>
+      <w:r>
+        <w:t>ChatBot</w:t>
+      </w:r>
+      <w:proofErr w:type="spellEnd"/>
+      <w:r>
+        <w:t xml:space="preserve"> Agentique</w:t>
+      </w:r>
+    </w:p>
+    <w:p/>
     <w:p>
       <w:pPr>
         <w:pStyle w:val="Heading1"/>
@@ -2755,7 +3137,48 @@
         </w:numPr>
       </w:pPr>
       <w:r>
-        <w:t>E</w:t>
+        <w:t>Client Flutter</w:t>
+      </w:r>
+    </w:p>
+    <w:p/>
+    <w:p>
+      <w:r>
+        <w:lastRenderedPageBreak/>
+        <w:drawing>
+          <wp:inline distT="0" distB="0" distL="0" distR="0" wp14:anchorId="77826559" wp14:editId="6076FA7F">
+            <wp:extent cx="5761219" cy="6172735"/>
+            <wp:effectExtent l="0" t="0" r="0" b="0"/>
+            <wp:docPr id="267103985" name="Picture 1"/>
+            <wp:cNvGraphicFramePr>
+              <a:graphicFrameLocks xmlns:a="http://schemas.openxmlformats.org/drawingml/2006/main" noChangeAspect="1"/>
+            </wp:cNvGraphicFramePr>
+            <a:graphic xmlns:a="http://schemas.openxmlformats.org/drawingml/2006/main">
+              <a:graphicData uri="http://schemas.openxmlformats.org/drawingml/2006/picture">
+                <pic:pic xmlns:pic="http://schemas.openxmlformats.org/drawingml/2006/picture">
+                  <pic:nvPicPr>
+                    <pic:cNvPr id="267103985" name=""/>
+                    <pic:cNvPicPr/>
+                  </pic:nvPicPr>
+                  <pic:blipFill>
+                    <a:blip r:embed="rId19"/>
+                    <a:stretch>
+                      <a:fillRect/>
+                    </a:stretch>
+                  </pic:blipFill>
+                  <pic:spPr>
+                    <a:xfrm>
+                      <a:off x="0" y="0"/>
+                      <a:ext cx="5761219" cy="6172735"/>
+                    </a:xfrm>
+                    <a:prstGeom prst="rect">
+                      <a:avLst/>
+                    </a:prstGeom>
+                  </pic:spPr>
+                </pic:pic>
+              </a:graphicData>
+            </a:graphic>
+          </wp:inline>
+        </w:drawing>
       </w:r>
     </w:p>
     <w:p>

</xml_diff>